<commit_message>
feat: Tich hop AI Groq tu dong doc de thi tu file Word va van ban tho, tinh chinh cat anh hinh hoc sac net
</commit_message>
<xml_diff>
--- a/public/samples/de_thi_hinh_binh_hanh_chuan.docx
+++ b/public/samples/de_thi_hinh_binh_hanh_chuan.docx
@@ -310,7 +310,7 @@
       <w:r>
         <w:drawing>
           <wp:inline xmlns:a="http://schemas.openxmlformats.org/drawingml/2006/main" xmlns:pic="http://schemas.openxmlformats.org/drawingml/2006/picture">
-            <wp:extent cx="3840480" cy="1536192"/>
+            <wp:extent cx="3840480" cy="1453067"/>
             <wp:docPr id="1" name="Picture 1"/>
             <wp:cNvGraphicFramePr>
               <a:graphicFrameLocks noChangeAspect="1"/>
@@ -331,7 +331,7 @@
                   <pic:spPr>
                     <a:xfrm>
                       <a:off x="0" y="0"/>
-                      <a:ext cx="3840480" cy="1536192"/>
+                      <a:ext cx="3840480" cy="1453067"/>
                     </a:xfrm>
                     <a:prstGeom prst="rect"/>
                   </pic:spPr>
@@ -417,7 +417,7 @@
       <w:r>
         <w:drawing>
           <wp:inline xmlns:a="http://schemas.openxmlformats.org/drawingml/2006/main" xmlns:pic="http://schemas.openxmlformats.org/drawingml/2006/picture">
-            <wp:extent cx="2743200" cy="2204357"/>
+            <wp:extent cx="2743200" cy="1645202"/>
             <wp:docPr id="2" name="Picture 2"/>
             <wp:cNvGraphicFramePr>
               <a:graphicFrameLocks noChangeAspect="1"/>
@@ -438,7 +438,7 @@
                   <pic:spPr>
                     <a:xfrm>
                       <a:off x="0" y="0"/>
-                      <a:ext cx="2743200" cy="2204357"/>
+                      <a:ext cx="2743200" cy="1645202"/>
                     </a:xfrm>
                     <a:prstGeom prst="rect"/>
                   </pic:spPr>
@@ -678,7 +678,7 @@
       <w:r>
         <w:drawing>
           <wp:inline xmlns:a="http://schemas.openxmlformats.org/drawingml/2006/main" xmlns:pic="http://schemas.openxmlformats.org/drawingml/2006/picture">
-            <wp:extent cx="2560320" cy="1920240"/>
+            <wp:extent cx="2560320" cy="1836079"/>
             <wp:docPr id="3" name="Picture 3"/>
             <wp:cNvGraphicFramePr>
               <a:graphicFrameLocks noChangeAspect="1"/>
@@ -699,7 +699,7 @@
                   <pic:spPr>
                     <a:xfrm>
                       <a:off x="0" y="0"/>
-                      <a:ext cx="2560320" cy="1920240"/>
+                      <a:ext cx="2560320" cy="1836079"/>
                     </a:xfrm>
                     <a:prstGeom prst="rect"/>
                   </pic:spPr>
@@ -785,7 +785,7 @@
       <w:r>
         <w:drawing>
           <wp:inline xmlns:a="http://schemas.openxmlformats.org/drawingml/2006/main" xmlns:pic="http://schemas.openxmlformats.org/drawingml/2006/picture">
-            <wp:extent cx="2560320" cy="2342420"/>
+            <wp:extent cx="2560320" cy="1492939"/>
             <wp:docPr id="4" name="Picture 4"/>
             <wp:cNvGraphicFramePr>
               <a:graphicFrameLocks noChangeAspect="1"/>
@@ -806,7 +806,7 @@
                   <pic:spPr>
                     <a:xfrm>
                       <a:off x="0" y="0"/>
-                      <a:ext cx="2560320" cy="2342420"/>
+                      <a:ext cx="2560320" cy="1492939"/>
                     </a:xfrm>
                     <a:prstGeom prst="rect"/>
                   </pic:spPr>
@@ -1120,7 +1120,7 @@
       <w:r>
         <w:drawing>
           <wp:inline xmlns:a="http://schemas.openxmlformats.org/drawingml/2006/main" xmlns:pic="http://schemas.openxmlformats.org/drawingml/2006/picture">
-            <wp:extent cx="2377440" cy="2377440"/>
+            <wp:extent cx="2377440" cy="1522246"/>
             <wp:docPr id="5" name="Picture 5"/>
             <wp:cNvGraphicFramePr>
               <a:graphicFrameLocks noChangeAspect="1"/>
@@ -1141,7 +1141,7 @@
                   <pic:spPr>
                     <a:xfrm>
                       <a:off x="0" y="0"/>
-                      <a:ext cx="2377440" cy="2377440"/>
+                      <a:ext cx="2377440" cy="1522246"/>
                     </a:xfrm>
                     <a:prstGeom prst="rect"/>
                   </pic:spPr>
@@ -1201,7 +1201,7 @@
       <w:r>
         <w:drawing>
           <wp:inline xmlns:a="http://schemas.openxmlformats.org/drawingml/2006/main" xmlns:pic="http://schemas.openxmlformats.org/drawingml/2006/picture">
-            <wp:extent cx="2377440" cy="2526030"/>
+            <wp:extent cx="2377440" cy="1860385"/>
             <wp:docPr id="6" name="Picture 6"/>
             <wp:cNvGraphicFramePr>
               <a:graphicFrameLocks noChangeAspect="1"/>
@@ -1222,7 +1222,7 @@
                   <pic:spPr>
                     <a:xfrm>
                       <a:off x="0" y="0"/>
-                      <a:ext cx="2377440" cy="2526030"/>
+                      <a:ext cx="2377440" cy="1860385"/>
                     </a:xfrm>
                     <a:prstGeom prst="rect"/>
                   </pic:spPr>
@@ -1356,7 +1356,7 @@
       <w:r>
         <w:drawing>
           <wp:inline xmlns:a="http://schemas.openxmlformats.org/drawingml/2006/main" xmlns:pic="http://schemas.openxmlformats.org/drawingml/2006/picture">
-            <wp:extent cx="2560320" cy="1579772"/>
+            <wp:extent cx="2560320" cy="1904177"/>
             <wp:docPr id="7" name="Picture 7"/>
             <wp:cNvGraphicFramePr>
               <a:graphicFrameLocks noChangeAspect="1"/>
@@ -1377,7 +1377,7 @@
                   <pic:spPr>
                     <a:xfrm>
                       <a:off x="0" y="0"/>
-                      <a:ext cx="2560320" cy="1579772"/>
+                      <a:ext cx="2560320" cy="1904177"/>
                     </a:xfrm>
                     <a:prstGeom prst="rect"/>
                   </pic:spPr>

</xml_diff>